<commit_message>
docs: ve lai Hinh 1 va de trong phan video/hinh anh
HINH 1 — doi NGUYEN TAC bo cuc chu khong keo lai tung mui ten.
Ban dau dat khoi theo toa do tu do roi noi bang mui ten CHEO, nen chi can vai
duong la cat nhau, va hai mui ten hai chieu giua fabric va IP chay de len nhau.
Ban moi:
  - moi tang la mot BANG NGANG chiem tron chieu rong
  - co COT LE TRAI rieng cho nhan tang, nhan khong de len khoi
  - moi mui ten chi di THANG DUNG hoac THANG NGANG, nen ve mat hinh hoc khong
    the co hai mui ten cat nhau
Giam be rong figure de khi ep ve 16,8 cm trong bao cao thi chu to va ro hon.
Script ve luu o scripts/gen_figure.py de tai lap duoc.

VIDEO va HINH ANH — theo quyet dinh cua nguoi phu trach (ban to chuc khong bat
buoc nen khong lam): bo doan kich ban video, giu nhan "VIDEO DEMO / QR" trong
bang nhung DE TRONG noi dung. Ghi ro o RTM §7 va DEVELOPMENT_BOOK rang day la
de trong CO CHU DICH, khong phai thieu sot.

Bao cao van 5 trang A4.

Co-Authored-By: Claude Opus 5 <noreply@anthropic.com>
</commit_message>
<xml_diff>
--- a/docs/BaoCao_SanPham_HuTieu_VMBMATTT_2026.docx
+++ b/docs/BaoCao_SanPham_HuTieu_VMBMATTT_2026.docx
@@ -716,7 +716,7 @@
       <w:r>
         <w:drawing>
           <wp:inline xmlns:a="http://schemas.openxmlformats.org/drawingml/2006/main" xmlns:pic="http://schemas.openxmlformats.org/drawingml/2006/picture">
-            <wp:extent cx="6048000" cy="3435907"/>
+            <wp:extent cx="6048000" cy="4373582"/>
             <wp:docPr id="1" name="Picture 1"/>
             <wp:cNvGraphicFramePr>
               <a:graphicFrameLocks noChangeAspect="1"/>
@@ -737,7 +737,7 @@
                   <pic:spPr>
                     <a:xfrm>
                       <a:off x="0" y="0"/>
-                      <a:ext cx="6048000" cy="3435907"/>
+                      <a:ext cx="6048000" cy="4373582"/>
                     </a:xfrm>
                     <a:prstGeom prst="rect"/>
                   </pic:spPr>
@@ -3989,29 +3989,6 @@
         <w:t>6.1. Hồ sơ sản phẩm và video demo</w:t>
       </w:r>
     </w:p>
-    <w:p>
-      <w:pPr>
-        <w:pStyle w:val="Heading2"/>
-        <w:spacing w:before="0" w:after="40" w:line="240" w:lineRule="auto"/>
-        <w:rPr>
-          <w:rFonts w:ascii="Times New Roman" w:hAnsi="Times New Roman" w:cs="Times New Roman"/>
-          <w:color w:val="000000" w:themeColor="text1"/>
-          <w:sz w:val="28"/>
-          <w:szCs w:val="28"/>
-        </w:rPr>
-      </w:pPr>
-      <w:r>
-        <w:rPr>
-          <w:rFonts w:ascii="Times New Roman" w:hAnsi="Times New Roman" w:cs="Times New Roman"/>
-          <w:b w:val="0"/>
-          <w:i/>
-          <w:color w:val="000000" w:themeColor="text1"/>
-          <w:sz w:val="18"/>
-          <w:szCs w:val="28"/>
-        </w:rPr>
-        <w:t>Kịch bản video: bài toán và mô hình đe dọa → sơ đồ bốn tầng và điểm tích hợp CSI → make sim (6/6 PASS) → nạp bitstream, chạy sweep 19 độ dài và bench 100 khung, quan sát ba đèn LED → chế độ tamper/timeout với hai pha A/B → kết luận và giới hạn.</w:t>
-      </w:r>
-    </w:p>
     <w:tbl>
       <w:tblPr>
         <w:tblStyle w:val="TableGrid"/>
@@ -4096,9 +4073,36 @@
               </w:rPr>
               <w:t>github.com/felixsuhimitsu/cast-256 — nhánh feat/aes-sha256-ip-integration.</w:t>
               <w:br/>
-              <w:t>Gồm 20 file RTL, 6 testbench, bộ kiểm phần cứng, và lớp tài liệu 11 bước trong docs/ (scope, spec, module map, kiến trúc, hợp đồng giao diện, WBS, ước lượng, rủi ro, gate, kế hoạch test, ma trận truy vết, 8 quyết định kiến trúc và nhật ký phát triển).</w:t>
-              <w:br/>
-              <w:t>VIDEO DEMO: [chờ quay — kịch bản ở mục dưới]</w:t>
+              <w:t>Gồm 23 file RTL, 6 testbench, bộ kiểm phần cứng, và lớp tài liệu 11 bước trong docs/ (scope, spec, module map, kiến trúc, hợp đồng giao diện, WBS, ước lượng, rủi ro, gate, kế hoạch test, ma trận truy vết, 8 quyết định kiến trúc và nhật ký phát triển).</w:t>
+            </w:r>
+          </w:p>
+        </w:tc>
+      </w:tr>
+      <w:tr>
+        <w:tc>
+          <w:tcPr>
+            <w:tcW w:type="dxa" w:w="2154"/>
+          </w:tcPr>
+          <w:p>
+            <w:r>
+              <w:rPr>
+                <w:b/>
+                <w:sz w:val="20"/>
+              </w:rPr>
+              <w:t>VIDEO DEMO / QR</w:t>
+            </w:r>
+          </w:p>
+        </w:tc>
+        <w:tc>
+          <w:tcPr>
+            <w:tcW w:type="dxa" w:w="6350"/>
+          </w:tcPr>
+          <w:p>
+            <w:r>
+              <w:rPr>
+                <w:b w:val="0"/>
+                <w:sz w:val="20"/>
+              </w:rPr>
             </w:r>
           </w:p>
         </w:tc>

</xml_diff>